<commit_message>
fix: 修复 gen_docx 背景色损坏bug — str(bg)[2:] 截掉了前2位hex
str(RGBColor(0x1A,0x1A,0x2E)) = '1A1A2E'
'1A1A2E'[2:] = '1A2E' ← 仅4位hex, Word无法识别

改为 str(bg) → 完整6位hex
三个脚本 (gen_docx.py/0629.py/0630.py) 全部修复
0630额外修复: 添加缺失的垂直居中(vAlign)

Co-Authored-By: Claude Opus 4.8 (1M context) <noreply@anthropic.com>
</commit_message>
<xml_diff>
--- a/2026年6月29日_1场预测.docx
+++ b/2026年6月29日_1场预测.docx
@@ -96,7 +96,7 @@
         <w:tc>
           <w:tcPr>
             <w:tcW w:type="dxa" w:w="403"/>
-            <w:shd w:fill="1A2E"/>
+            <w:shd w:fill="1A1A2E"/>
             <w:vAlign w:val="center"/>
           </w:tcPr>
           <w:p>
@@ -118,7 +118,7 @@
         <w:tc>
           <w:tcPr>
             <w:tcW w:type="dxa" w:w="648"/>
-            <w:shd w:fill="1A2E"/>
+            <w:shd w:fill="1A1A2E"/>
             <w:vAlign w:val="center"/>
           </w:tcPr>
           <w:p>
@@ -140,7 +140,7 @@
         <w:tc>
           <w:tcPr>
             <w:tcW w:type="dxa" w:w="504"/>
-            <w:shd w:fill="1A2E"/>
+            <w:shd w:fill="1A1A2E"/>
             <w:vAlign w:val="center"/>
           </w:tcPr>
           <w:p>
@@ -162,7 +162,7 @@
         <w:tc>
           <w:tcPr>
             <w:tcW w:type="dxa" w:w="3024"/>
-            <w:shd w:fill="1A2E"/>
+            <w:shd w:fill="1A1A2E"/>
             <w:vAlign w:val="center"/>
           </w:tcPr>
           <w:p>
@@ -184,7 +184,7 @@
         <w:tc>
           <w:tcPr>
             <w:tcW w:type="dxa" w:w="2592"/>
-            <w:shd w:fill="1A2E"/>
+            <w:shd w:fill="1A1A2E"/>
             <w:vAlign w:val="center"/>
           </w:tcPr>
           <w:p>
@@ -206,7 +206,7 @@
         <w:tc>
           <w:tcPr>
             <w:tcW w:type="dxa" w:w="1224"/>
-            <w:shd w:fill="1A2E"/>
+            <w:shd w:fill="1A1A2E"/>
             <w:vAlign w:val="center"/>
           </w:tcPr>
           <w:p>
@@ -228,7 +228,7 @@
         <w:tc>
           <w:tcPr>
             <w:tcW w:type="dxa" w:w="792"/>
-            <w:shd w:fill="1A2E"/>
+            <w:shd w:fill="1A1A2E"/>
             <w:vAlign w:val="center"/>
           </w:tcPr>
           <w:p>
@@ -250,7 +250,7 @@
         <w:tc>
           <w:tcPr>
             <w:tcW w:type="dxa" w:w="1872"/>
-            <w:shd w:fill="1A2E"/>
+            <w:shd w:fill="1A1A2E"/>
             <w:vAlign w:val="center"/>
           </w:tcPr>
           <w:p>
@@ -272,7 +272,7 @@
         <w:tc>
           <w:tcPr>
             <w:tcW w:type="dxa" w:w="792"/>
-            <w:shd w:fill="1A2E"/>
+            <w:shd w:fill="1A1A2E"/>
             <w:vAlign w:val="center"/>
           </w:tcPr>
           <w:p>
@@ -528,7 +528,7 @@
         <w:tc>
           <w:tcPr>
             <w:tcW w:type="dxa" w:w="720"/>
-            <w:shd w:fill="1A2E"/>
+            <w:shd w:fill="1A1A2E"/>
             <w:vAlign w:val="center"/>
           </w:tcPr>
           <w:p>
@@ -549,7 +549,7 @@
         <w:tc>
           <w:tcPr>
             <w:tcW w:type="dxa" w:w="4752"/>
-            <w:shd w:fill="1A2E"/>
+            <w:shd w:fill="1A1A2E"/>
             <w:vAlign w:val="center"/>
           </w:tcPr>
           <w:p>
@@ -571,7 +571,7 @@
         <w:tc>
           <w:tcPr>
             <w:tcW w:type="dxa" w:w="4752"/>
-            <w:shd w:fill="1A2E"/>
+            <w:shd w:fill="1A1A2E"/>
             <w:vAlign w:val="center"/>
           </w:tcPr>
           <w:p>
@@ -657,7 +657,7 @@
         <w:tc>
           <w:tcPr>
             <w:tcW w:type="dxa" w:w="720"/>
-            <w:shd w:fill="F2F2"/>
+            <w:shd w:fill="F2F2F2"/>
             <w:vAlign w:val="center"/>
           </w:tcPr>
           <w:p>
@@ -678,7 +678,7 @@
         <w:tc>
           <w:tcPr>
             <w:tcW w:type="dxa" w:w="4752"/>
-            <w:shd w:fill="F2F2"/>
+            <w:shd w:fill="F2F2F2"/>
             <w:vAlign w:val="center"/>
           </w:tcPr>
           <w:p>
@@ -699,7 +699,7 @@
         <w:tc>
           <w:tcPr>
             <w:tcW w:type="dxa" w:w="4752"/>
-            <w:shd w:fill="F2F2"/>
+            <w:shd w:fill="F2F2F2"/>
             <w:vAlign w:val="center"/>
           </w:tcPr>
           <w:p>
@@ -784,7 +784,7 @@
         <w:tc>
           <w:tcPr>
             <w:tcW w:type="dxa" w:w="720"/>
-            <w:shd w:fill="F2F2"/>
+            <w:shd w:fill="F2F2F2"/>
             <w:vAlign w:val="center"/>
           </w:tcPr>
           <w:p>
@@ -805,7 +805,7 @@
         <w:tc>
           <w:tcPr>
             <w:tcW w:type="dxa" w:w="4752"/>
-            <w:shd w:fill="F2F2"/>
+            <w:shd w:fill="F2F2F2"/>
             <w:vAlign w:val="center"/>
           </w:tcPr>
           <w:p>
@@ -826,7 +826,7 @@
         <w:tc>
           <w:tcPr>
             <w:tcW w:type="dxa" w:w="4752"/>
-            <w:shd w:fill="F2F2"/>
+            <w:shd w:fill="F2F2F2"/>
             <w:vAlign w:val="center"/>
           </w:tcPr>
           <w:p>
@@ -966,7 +966,7 @@
         <w:tc>
           <w:tcPr>
             <w:tcW w:type="dxa" w:w="1008"/>
-            <w:shd w:fill="1A2E"/>
+            <w:shd w:fill="1A1A2E"/>
             <w:vAlign w:val="center"/>
           </w:tcPr>
           <w:p>
@@ -988,7 +988,7 @@
         <w:tc>
           <w:tcPr>
             <w:tcW w:type="dxa" w:w="3168"/>
-            <w:shd w:fill="1A2E"/>
+            <w:shd w:fill="1A1A2E"/>
             <w:vAlign w:val="center"/>
           </w:tcPr>
           <w:p>
@@ -1010,7 +1010,7 @@
         <w:tc>
           <w:tcPr>
             <w:tcW w:type="dxa" w:w="1728"/>
-            <w:shd w:fill="1A2E"/>
+            <w:shd w:fill="1A1A2E"/>
             <w:vAlign w:val="center"/>
           </w:tcPr>
           <w:p>
@@ -1032,7 +1032,7 @@
         <w:tc>
           <w:tcPr>
             <w:tcW w:type="dxa" w:w="4608"/>
-            <w:shd w:fill="1A2E"/>
+            <w:shd w:fill="1A1A2E"/>
             <w:vAlign w:val="center"/>
           </w:tcPr>
           <w:p>
@@ -1139,7 +1139,7 @@
         <w:tc>
           <w:tcPr>
             <w:tcW w:type="dxa" w:w="1008"/>
-            <w:shd w:fill="F2F2"/>
+            <w:shd w:fill="F2F2F2"/>
             <w:vAlign w:val="center"/>
           </w:tcPr>
           <w:p>
@@ -1160,7 +1160,7 @@
         <w:tc>
           <w:tcPr>
             <w:tcW w:type="dxa" w:w="3168"/>
-            <w:shd w:fill="F2F2"/>
+            <w:shd w:fill="F2F2F2"/>
             <w:vAlign w:val="center"/>
           </w:tcPr>
           <w:p>
@@ -1181,7 +1181,7 @@
         <w:tc>
           <w:tcPr>
             <w:tcW w:type="dxa" w:w="1728"/>
-            <w:shd w:fill="F2F2"/>
+            <w:shd w:fill="F2F2F2"/>
             <w:vAlign w:val="center"/>
           </w:tcPr>
           <w:p>
@@ -1202,7 +1202,7 @@
         <w:tc>
           <w:tcPr>
             <w:tcW w:type="dxa" w:w="4608"/>
-            <w:shd w:fill="F2F2"/>
+            <w:shd w:fill="F2F2F2"/>
             <w:vAlign w:val="center"/>
           </w:tcPr>
           <w:p>
@@ -1308,7 +1308,7 @@
         <w:tc>
           <w:tcPr>
             <w:tcW w:type="dxa" w:w="1008"/>
-            <w:shd w:fill="F2F2"/>
+            <w:shd w:fill="F2F2F2"/>
             <w:vAlign w:val="center"/>
           </w:tcPr>
           <w:p>
@@ -1329,7 +1329,7 @@
         <w:tc>
           <w:tcPr>
             <w:tcW w:type="dxa" w:w="3168"/>
-            <w:shd w:fill="F2F2"/>
+            <w:shd w:fill="F2F2F2"/>
             <w:vAlign w:val="center"/>
           </w:tcPr>
           <w:p>
@@ -1350,7 +1350,7 @@
         <w:tc>
           <w:tcPr>
             <w:tcW w:type="dxa" w:w="1728"/>
-            <w:shd w:fill="F2F2"/>
+            <w:shd w:fill="F2F2F2"/>
             <w:vAlign w:val="center"/>
           </w:tcPr>
           <w:p>
@@ -1371,7 +1371,7 @@
         <w:tc>
           <w:tcPr>
             <w:tcW w:type="dxa" w:w="4608"/>
-            <w:shd w:fill="F2F2"/>
+            <w:shd w:fill="F2F2F2"/>
             <w:vAlign w:val="center"/>
           </w:tcPr>
           <w:p>
@@ -1476,7 +1476,7 @@
         <w:tc>
           <w:tcPr>
             <w:tcW w:type="dxa" w:w="1008"/>
-            <w:shd w:fill="F2F2"/>
+            <w:shd w:fill="F2F2F2"/>
             <w:vAlign w:val="center"/>
           </w:tcPr>
           <w:p>
@@ -1497,7 +1497,7 @@
         <w:tc>
           <w:tcPr>
             <w:tcW w:type="dxa" w:w="3168"/>
-            <w:shd w:fill="F2F2"/>
+            <w:shd w:fill="F2F2F2"/>
             <w:vAlign w:val="center"/>
           </w:tcPr>
           <w:p>
@@ -1518,7 +1518,7 @@
         <w:tc>
           <w:tcPr>
             <w:tcW w:type="dxa" w:w="1728"/>
-            <w:shd w:fill="F2F2"/>
+            <w:shd w:fill="F2F2F2"/>
             <w:vAlign w:val="center"/>
           </w:tcPr>
           <w:p>
@@ -1539,7 +1539,7 @@
         <w:tc>
           <w:tcPr>
             <w:tcW w:type="dxa" w:w="4608"/>
-            <w:shd w:fill="F2F2"/>
+            <w:shd w:fill="F2F2F2"/>
             <w:vAlign w:val="center"/>
           </w:tcPr>
           <w:p>
@@ -1590,7 +1590,7 @@
         <w:tc>
           <w:tcPr>
             <w:tcW w:type="dxa" w:w="5040"/>
-            <w:shd w:fill="1A2E"/>
+            <w:shd w:fill="1A1A2E"/>
             <w:vAlign w:val="center"/>
           </w:tcPr>
           <w:p>
@@ -1612,7 +1612,7 @@
         <w:tc>
           <w:tcPr>
             <w:tcW w:type="dxa" w:w="2304"/>
-            <w:shd w:fill="1A2E"/>
+            <w:shd w:fill="1A1A2E"/>
             <w:vAlign w:val="center"/>
           </w:tcPr>
           <w:p>
@@ -1634,7 +1634,7 @@
         <w:tc>
           <w:tcPr>
             <w:tcW w:type="dxa" w:w="7776"/>
-            <w:shd w:fill="1A2E"/>
+            <w:shd w:fill="1A1A2E"/>
             <w:vAlign w:val="center"/>
           </w:tcPr>
           <w:p>
@@ -1741,7 +1741,7 @@
         <w:tc>
           <w:tcPr>
             <w:tcW w:type="dxa" w:w="2304"/>
-            <w:shd w:fill="F2F2"/>
+            <w:shd w:fill="F2F2F2"/>
             <w:vAlign w:val="center"/>
           </w:tcPr>
           <w:p>
@@ -1763,7 +1763,7 @@
         <w:tc>
           <w:tcPr>
             <w:tcW w:type="dxa" w:w="7776"/>
-            <w:shd w:fill="F2F2"/>
+            <w:shd w:fill="F2F2F2"/>
             <w:vAlign w:val="center"/>
           </w:tcPr>
           <w:p>
@@ -1868,7 +1868,7 @@
         <w:tc>
           <w:tcPr>
             <w:tcW w:type="dxa" w:w="2304"/>
-            <w:shd w:fill="F2F2"/>
+            <w:shd w:fill="F2F2F2"/>
             <w:vAlign w:val="center"/>
           </w:tcPr>
           <w:p>
@@ -1890,7 +1890,7 @@
         <w:tc>
           <w:tcPr>
             <w:tcW w:type="dxa" w:w="7776"/>
-            <w:shd w:fill="F2F2"/>
+            <w:shd w:fill="F2F2F2"/>
             <w:vAlign w:val="center"/>
           </w:tcPr>
           <w:p>
@@ -1996,7 +1996,7 @@
         <w:tc>
           <w:tcPr>
             <w:tcW w:type="dxa" w:w="2304"/>
-            <w:shd w:fill="F2F2"/>
+            <w:shd w:fill="F2F2F2"/>
             <w:vAlign w:val="center"/>
           </w:tcPr>
           <w:p>
@@ -2017,7 +2017,7 @@
         <w:tc>
           <w:tcPr>
             <w:tcW w:type="dxa" w:w="7776"/>
-            <w:shd w:fill="F2F2"/>
+            <w:shd w:fill="F2F2F2"/>
             <w:vAlign w:val="center"/>
           </w:tcPr>
           <w:p>
@@ -2122,7 +2122,7 @@
         <w:tc>
           <w:tcPr>
             <w:tcW w:type="dxa" w:w="2304"/>
-            <w:shd w:fill="F2F2"/>
+            <w:shd w:fill="F2F2F2"/>
             <w:vAlign w:val="center"/>
           </w:tcPr>
           <w:p>
@@ -2143,7 +2143,7 @@
         <w:tc>
           <w:tcPr>
             <w:tcW w:type="dxa" w:w="7776"/>
-            <w:shd w:fill="F2F2"/>
+            <w:shd w:fill="F2F2F2"/>
             <w:vAlign w:val="center"/>
           </w:tcPr>
           <w:p>
@@ -2248,7 +2248,7 @@
         <w:tc>
           <w:tcPr>
             <w:tcW w:type="dxa" w:w="2304"/>
-            <w:shd w:fill="F2F2"/>
+            <w:shd w:fill="F2F2F2"/>
             <w:vAlign w:val="center"/>
           </w:tcPr>
           <w:p>
@@ -2269,7 +2269,7 @@
         <w:tc>
           <w:tcPr>
             <w:tcW w:type="dxa" w:w="7776"/>
-            <w:shd w:fill="F2F2"/>
+            <w:shd w:fill="F2F2F2"/>
             <w:vAlign w:val="center"/>
           </w:tcPr>
           <w:p>
@@ -2374,7 +2374,7 @@
         <w:tc>
           <w:tcPr>
             <w:tcW w:type="dxa" w:w="2304"/>
-            <w:shd w:fill="F2F2"/>
+            <w:shd w:fill="F2F2F2"/>
             <w:vAlign w:val="center"/>
           </w:tcPr>
           <w:p>
@@ -2395,7 +2395,7 @@
         <w:tc>
           <w:tcPr>
             <w:tcW w:type="dxa" w:w="7776"/>
-            <w:shd w:fill="F2F2"/>
+            <w:shd w:fill="F2F2F2"/>
             <w:vAlign w:val="center"/>
           </w:tcPr>
           <w:p>
@@ -2491,7 +2491,7 @@
         <w:tc>
           <w:tcPr>
             <w:tcW w:type="dxa" w:w="2592"/>
-            <w:shd w:fill="1A2E"/>
+            <w:shd w:fill="1A1A2E"/>
             <w:vAlign w:val="center"/>
           </w:tcPr>
           <w:p>
@@ -2513,7 +2513,7 @@
         <w:tc>
           <w:tcPr>
             <w:tcW w:type="dxa" w:w="1728"/>
-            <w:shd w:fill="1A2E"/>
+            <w:shd w:fill="1A1A2E"/>
             <w:vAlign w:val="center"/>
           </w:tcPr>
           <w:p>
@@ -2535,7 +2535,7 @@
         <w:tc>
           <w:tcPr>
             <w:tcW w:type="dxa" w:w="5760"/>
-            <w:shd w:fill="1A2E"/>
+            <w:shd w:fill="1A1A2E"/>
             <w:vAlign w:val="center"/>
           </w:tcPr>
           <w:p>
@@ -2622,7 +2622,7 @@
         <w:tc>
           <w:tcPr>
             <w:tcW w:type="dxa" w:w="2592"/>
-            <w:shd w:fill="F2F2"/>
+            <w:shd w:fill="F2F2F2"/>
             <w:vAlign w:val="center"/>
           </w:tcPr>
           <w:p>
@@ -2643,7 +2643,7 @@
         <w:tc>
           <w:tcPr>
             <w:tcW w:type="dxa" w:w="1728"/>
-            <w:shd w:fill="F2F2"/>
+            <w:shd w:fill="F2F2F2"/>
             <w:vAlign w:val="center"/>
           </w:tcPr>
           <w:p>
@@ -2665,7 +2665,7 @@
         <w:tc>
           <w:tcPr>
             <w:tcW w:type="dxa" w:w="5760"/>
-            <w:shd w:fill="F2F2"/>
+            <w:shd w:fill="F2F2F2"/>
             <w:vAlign w:val="center"/>
           </w:tcPr>
           <w:p>
@@ -2751,7 +2751,7 @@
         <w:tc>
           <w:tcPr>
             <w:tcW w:type="dxa" w:w="2592"/>
-            <w:shd w:fill="F2F2"/>
+            <w:shd w:fill="F2F2F2"/>
             <w:vAlign w:val="center"/>
           </w:tcPr>
           <w:p>
@@ -2772,7 +2772,7 @@
         <w:tc>
           <w:tcPr>
             <w:tcW w:type="dxa" w:w="1728"/>
-            <w:shd w:fill="F2F2"/>
+            <w:shd w:fill="F2F2F2"/>
             <w:vAlign w:val="center"/>
           </w:tcPr>
           <w:p>
@@ -2794,7 +2794,7 @@
         <w:tc>
           <w:tcPr>
             <w:tcW w:type="dxa" w:w="5760"/>
-            <w:shd w:fill="F2F2"/>
+            <w:shd w:fill="F2F2F2"/>
             <w:vAlign w:val="center"/>
           </w:tcPr>
           <w:p>
@@ -3031,7 +3031,7 @@
         <w:tc>
           <w:tcPr>
             <w:tcW w:type="dxa" w:w="1152"/>
-            <w:shd w:fill="1A2E"/>
+            <w:shd w:fill="1A1A2E"/>
             <w:vAlign w:val="center"/>
           </w:tcPr>
           <w:p>
@@ -3053,7 +3053,7 @@
         <w:tc>
           <w:tcPr>
             <w:tcW w:type="dxa" w:w="1728"/>
-            <w:shd w:fill="1A2E"/>
+            <w:shd w:fill="1A1A2E"/>
             <w:vAlign w:val="center"/>
           </w:tcPr>
           <w:p>
@@ -3075,7 +3075,7 @@
         <w:tc>
           <w:tcPr>
             <w:tcW w:type="dxa" w:w="1008"/>
-            <w:shd w:fill="1A2E"/>
+            <w:shd w:fill="1A1A2E"/>
             <w:vAlign w:val="center"/>
           </w:tcPr>
           <w:p>
@@ -3097,7 +3097,7 @@
         <w:tc>
           <w:tcPr>
             <w:tcW w:type="dxa" w:w="11232"/>
-            <w:shd w:fill="1A2E"/>
+            <w:shd w:fill="1A1A2E"/>
             <w:vAlign w:val="center"/>
           </w:tcPr>
           <w:p>
@@ -3121,7 +3121,7 @@
         <w:tc>
           <w:tcPr>
             <w:tcW w:type="dxa" w:w="1152"/>
-            <w:shd w:fill="F8F5"/>
+            <w:shd w:fill="E8F8F5"/>
             <w:vAlign w:val="center"/>
           </w:tcPr>
           <w:p>
@@ -3142,7 +3142,7 @@
         <w:tc>
           <w:tcPr>
             <w:tcW w:type="dxa" w:w="1728"/>
-            <w:shd w:fill="F8F5"/>
+            <w:shd w:fill="E8F8F5"/>
             <w:vAlign w:val="center"/>
           </w:tcPr>
           <w:p>
@@ -3163,7 +3163,7 @@
         <w:tc>
           <w:tcPr>
             <w:tcW w:type="dxa" w:w="1008"/>
-            <w:shd w:fill="F8F5"/>
+            <w:shd w:fill="E8F8F5"/>
             <w:vAlign w:val="center"/>
           </w:tcPr>
           <w:p>
@@ -3184,7 +3184,7 @@
         <w:tc>
           <w:tcPr>
             <w:tcW w:type="dxa" w:w="11232"/>
-            <w:shd w:fill="F8F5"/>
+            <w:shd w:fill="E8F8F5"/>
             <w:vAlign w:val="center"/>
           </w:tcPr>
           <w:p>
@@ -3207,7 +3207,7 @@
         <w:tc>
           <w:tcPr>
             <w:tcW w:type="dxa" w:w="1152"/>
-            <w:shd w:fill="F2F2"/>
+            <w:shd w:fill="F2F2F2"/>
             <w:vAlign w:val="center"/>
           </w:tcPr>
           <w:p>
@@ -3228,7 +3228,7 @@
         <w:tc>
           <w:tcPr>
             <w:tcW w:type="dxa" w:w="1728"/>
-            <w:shd w:fill="F2F2"/>
+            <w:shd w:fill="F2F2F2"/>
             <w:vAlign w:val="center"/>
           </w:tcPr>
           <w:p>
@@ -3249,7 +3249,7 @@
         <w:tc>
           <w:tcPr>
             <w:tcW w:type="dxa" w:w="1008"/>
-            <w:shd w:fill="F2F2"/>
+            <w:shd w:fill="F2F2F2"/>
             <w:vAlign w:val="center"/>
           </w:tcPr>
           <w:p>
@@ -3270,7 +3270,7 @@
         <w:tc>
           <w:tcPr>
             <w:tcW w:type="dxa" w:w="11232"/>
-            <w:shd w:fill="F2F2"/>
+            <w:shd w:fill="F2F2F2"/>
             <w:vAlign w:val="center"/>
           </w:tcPr>
           <w:p>
@@ -3375,7 +3375,7 @@
         <w:tc>
           <w:tcPr>
             <w:tcW w:type="dxa" w:w="1152"/>
-            <w:shd w:fill="F2F2"/>
+            <w:shd w:fill="F2F2F2"/>
             <w:vAlign w:val="center"/>
           </w:tcPr>
           <w:p>
@@ -3396,7 +3396,7 @@
         <w:tc>
           <w:tcPr>
             <w:tcW w:type="dxa" w:w="1728"/>
-            <w:shd w:fill="F2F2"/>
+            <w:shd w:fill="F2F2F2"/>
             <w:vAlign w:val="center"/>
           </w:tcPr>
           <w:p>
@@ -3417,7 +3417,7 @@
         <w:tc>
           <w:tcPr>
             <w:tcW w:type="dxa" w:w="1008"/>
-            <w:shd w:fill="F2F2"/>
+            <w:shd w:fill="F2F2F2"/>
             <w:vAlign w:val="center"/>
           </w:tcPr>
           <w:p>
@@ -3438,7 +3438,7 @@
         <w:tc>
           <w:tcPr>
             <w:tcW w:type="dxa" w:w="11232"/>
-            <w:shd w:fill="F2F2"/>
+            <w:shd w:fill="F2F2F2"/>
             <w:vAlign w:val="center"/>
           </w:tcPr>
           <w:p>
@@ -3571,7 +3571,7 @@
         <w:tc>
           <w:tcPr>
             <w:tcW w:type="dxa" w:w="1152"/>
-            <w:shd w:fill="1A2E"/>
+            <w:shd w:fill="1A1A2E"/>
             <w:vAlign w:val="center"/>
           </w:tcPr>
           <w:p>
@@ -3593,7 +3593,7 @@
         <w:tc>
           <w:tcPr>
             <w:tcW w:type="dxa" w:w="2880"/>
-            <w:shd w:fill="1A2E"/>
+            <w:shd w:fill="1A1A2E"/>
             <w:vAlign w:val="center"/>
           </w:tcPr>
           <w:p>
@@ -3615,7 +3615,7 @@
         <w:tc>
           <w:tcPr>
             <w:tcW w:type="dxa" w:w="5040"/>
-            <w:shd w:fill="1A2E"/>
+            <w:shd w:fill="1A1A2E"/>
             <w:vAlign w:val="center"/>
           </w:tcPr>
           <w:p>
@@ -3639,7 +3639,7 @@
         <w:tc>
           <w:tcPr>
             <w:tcW w:type="dxa" w:w="1152"/>
-            <w:shd w:fill="F8F5"/>
+            <w:shd w:fill="E8F8F5"/>
             <w:vAlign w:val="center"/>
           </w:tcPr>
           <w:p>
@@ -3660,7 +3660,7 @@
         <w:tc>
           <w:tcPr>
             <w:tcW w:type="dxa" w:w="2880"/>
-            <w:shd w:fill="F8F5"/>
+            <w:shd w:fill="E8F8F5"/>
             <w:vAlign w:val="center"/>
           </w:tcPr>
           <w:p>
@@ -3681,7 +3681,7 @@
         <w:tc>
           <w:tcPr>
             <w:tcW w:type="dxa" w:w="5040"/>
-            <w:shd w:fill="F8F5"/>
+            <w:shd w:fill="E8F8F5"/>
             <w:vAlign w:val="center"/>
           </w:tcPr>
           <w:p>
@@ -3704,7 +3704,7 @@
         <w:tc>
           <w:tcPr>
             <w:tcW w:type="dxa" w:w="1152"/>
-            <w:shd w:fill="F2F2"/>
+            <w:shd w:fill="F2F2F2"/>
             <w:vAlign w:val="center"/>
           </w:tcPr>
           <w:p>
@@ -3725,7 +3725,7 @@
         <w:tc>
           <w:tcPr>
             <w:tcW w:type="dxa" w:w="2880"/>
-            <w:shd w:fill="F2F2"/>
+            <w:shd w:fill="F2F2F2"/>
             <w:vAlign w:val="center"/>
           </w:tcPr>
           <w:p>
@@ -3746,7 +3746,7 @@
         <w:tc>
           <w:tcPr>
             <w:tcW w:type="dxa" w:w="5040"/>
-            <w:shd w:fill="F2F2"/>
+            <w:shd w:fill="F2F2F2"/>
             <w:vAlign w:val="center"/>
           </w:tcPr>
           <w:p>

</xml_diff>